<commit_message>
Update Features to add to Harrix.docx
</commit_message>
<xml_diff>
--- a/Current Docs/Features to add to Harrix.docx
+++ b/Current Docs/Features to add to Harrix.docx
@@ -1,6 +1,6 @@
 
 <file path=word/document.xml><?xml version="1.0" encoding="utf-8"?>
-<w:document xmlns:wpc="http://schemas.microsoft.com/office/word/2010/wordprocessingCanvas" xmlns:cx="http://schemas.microsoft.com/office/drawing/2014/chartex" xmlns:cx1="http://schemas.microsoft.com/office/drawing/2015/9/8/chartex" xmlns:cx2="http://schemas.microsoft.com/office/drawing/2015/10/21/chartex" xmlns:cx3="http://schemas.microsoft.com/office/drawing/2016/5/9/chartex" xmlns:cx4="http://schemas.microsoft.com/office/drawing/2016/5/10/chartex" xmlns:cx5="http://schemas.microsoft.com/office/drawing/2016/5/11/chartex" xmlns:cx6="http://schemas.microsoft.com/office/drawing/2016/5/12/chartex" xmlns:cx7="http://schemas.microsoft.com/office/drawing/2016/5/13/chartex" xmlns:cx8="http://schemas.microsoft.com/office/drawing/2016/5/14/chartex" xmlns:mc="http://schemas.openxmlformats.org/markup-compatibility/2006" xmlns:aink="http://schemas.microsoft.com/office/drawing/2016/ink" xmlns:am3d="http://schemas.microsoft.com/office/drawing/2017/model3d" xmlns:o="urn:schemas-microsoft-com:office:office" xmlns:oel="http://schemas.microsoft.com/office/2019/extlst" xmlns:r="http://schemas.openxmlformats.org/officeDocument/2006/relationships" xmlns:m="http://schemas.openxmlformats.org/officeDocument/2006/math" xmlns:v="urn:schemas-microsoft-com:vml" xmlns:wp14="http://schemas.microsoft.com/office/word/2010/wordprocessingDrawing" xmlns:wp="http://schemas.openxmlformats.org/drawingml/2006/wordprocessingDrawing" xmlns:w10="urn:schemas-microsoft-com:office:word" xmlns:w="http://schemas.openxmlformats.org/wordprocessingml/2006/main" xmlns:w14="http://schemas.microsoft.com/office/word/2010/wordml" xmlns:w15="http://schemas.microsoft.com/office/word/2012/wordml" xmlns:w16cex="http://schemas.microsoft.com/office/word/2018/wordml/cex" xmlns:w16cid="http://schemas.microsoft.com/office/word/2016/wordml/cid" xmlns:w16="http://schemas.microsoft.com/office/word/2018/wordml" xmlns:w16sdtdh="http://schemas.microsoft.com/office/word/2020/wordml/sdtdatahash" xmlns:w16se="http://schemas.microsoft.com/office/word/2015/wordml/symex" xmlns:wpg="http://schemas.microsoft.com/office/word/2010/wordprocessingGroup" xmlns:wpi="http://schemas.microsoft.com/office/word/2010/wordprocessingInk" xmlns:wne="http://schemas.microsoft.com/office/word/2006/wordml" xmlns:wps="http://schemas.microsoft.com/office/word/2010/wordprocessingShape" mc:Ignorable="w14 w15 w16se w16cid w16 w16cex w16sdtdh wp14">
+<w:document xmlns:wpc="http://schemas.microsoft.com/office/word/2010/wordprocessingCanvas" xmlns:cx="http://schemas.microsoft.com/office/drawing/2014/chartex" xmlns:cx1="http://schemas.microsoft.com/office/drawing/2015/9/8/chartex" xmlns:cx2="http://schemas.microsoft.com/office/drawing/2015/10/21/chartex" xmlns:cx3="http://schemas.microsoft.com/office/drawing/2016/5/9/chartex" xmlns:cx4="http://schemas.microsoft.com/office/drawing/2016/5/10/chartex" xmlns:cx5="http://schemas.microsoft.com/office/drawing/2016/5/11/chartex" xmlns:cx6="http://schemas.microsoft.com/office/drawing/2016/5/12/chartex" xmlns:cx7="http://schemas.microsoft.com/office/drawing/2016/5/13/chartex" xmlns:cx8="http://schemas.microsoft.com/office/drawing/2016/5/14/chartex" xmlns:mc="http://schemas.openxmlformats.org/markup-compatibility/2006" xmlns:aink="http://schemas.microsoft.com/office/drawing/2016/ink" xmlns:am3d="http://schemas.microsoft.com/office/drawing/2017/model3d" xmlns:o="urn:schemas-microsoft-com:office:office" xmlns:oel="http://schemas.microsoft.com/office/2019/extlst" xmlns:r="http://schemas.openxmlformats.org/officeDocument/2006/relationships" xmlns:m="http://schemas.openxmlformats.org/officeDocument/2006/math" xmlns:v="urn:schemas-microsoft-com:vml" xmlns:wp14="http://schemas.microsoft.com/office/word/2010/wordprocessingDrawing" xmlns:wp="http://schemas.openxmlformats.org/drawingml/2006/wordprocessingDrawing" xmlns:w10="urn:schemas-microsoft-com:office:word" xmlns:w="http://schemas.openxmlformats.org/wordprocessingml/2006/main" xmlns:w14="http://schemas.microsoft.com/office/word/2010/wordml" xmlns:w15="http://schemas.microsoft.com/office/word/2012/wordml" xmlns:w16cex="http://schemas.microsoft.com/office/word/2018/wordml/cex" xmlns:w16cid="http://schemas.microsoft.com/office/word/2016/wordml/cid" xmlns:w16="http://schemas.microsoft.com/office/word/2018/wordml" xmlns:w16du="http://schemas.microsoft.com/office/word/2023/wordml/word16du" xmlns:w16sdtdh="http://schemas.microsoft.com/office/word/2020/wordml/sdtdatahash" xmlns:w16sdtfl="http://schemas.microsoft.com/office/word/2024/wordml/sdtformatlock" xmlns:w16se="http://schemas.microsoft.com/office/word/2015/wordml/symex" xmlns:wpg="http://schemas.microsoft.com/office/word/2010/wordprocessingGroup" xmlns:wpi="http://schemas.microsoft.com/office/word/2010/wordprocessingInk" xmlns:wne="http://schemas.microsoft.com/office/word/2006/wordml" xmlns:wps="http://schemas.microsoft.com/office/word/2010/wordprocessingShape" mc:Ignorable="w14 w15 w16se w16cid w16 w16cex w16sdtdh w16sdtfl w16du wp14">
   <w:body>
     <w:p>
       <w:pPr>
@@ -292,7 +292,7 @@
       <w:pPr>
         <w:spacing w:before="100" w:beforeAutospacing="1" w:after="100" w:afterAutospacing="1"/>
         <w:rPr>
-          <w:lang w:val="fr-FR"/>
+          <w:lang w:val="en-US"/>
         </w:rPr>
       </w:pPr>
       <w:r>
@@ -334,52 +334,32 @@
       </w:r>
       <w:r>
         <w:rPr>
-          <w:lang w:val="fr-FR"/>
-        </w:rPr>
-        <w:t xml:space="preserve">It </w:t>
+          <w:lang w:val="en-US"/>
+        </w:rPr>
+        <w:t xml:space="preserve">It could be </w:t>
       </w:r>
       <w:proofErr w:type="spellStart"/>
       <w:r>
         <w:rPr>
-          <w:lang w:val="fr-FR"/>
-        </w:rPr>
-        <w:t>could</w:t>
+          <w:lang w:val="en-US"/>
+        </w:rPr>
+        <w:t>smth</w:t>
       </w:r>
       <w:proofErr w:type="spellEnd"/>
       <w:r>
         <w:rPr>
-          <w:lang w:val="fr-FR"/>
+          <w:lang w:val="en-US"/>
         </w:rPr>
         <w:t xml:space="preserve"> </w:t>
       </w:r>
-      <w:proofErr w:type="spellStart"/>
-      <w:r>
-        <w:rPr>
-          <w:lang w:val="fr-FR"/>
-        </w:rPr>
-        <w:t>be</w:t>
-      </w:r>
-      <w:proofErr w:type="spellEnd"/>
-      <w:r>
-        <w:rPr>
-          <w:lang w:val="fr-FR"/>
-        </w:rPr>
-        <w:t xml:space="preserve"> </w:t>
-      </w:r>
-      <w:proofErr w:type="spellStart"/>
-      <w:r>
-        <w:rPr>
-          <w:lang w:val="fr-FR"/>
-        </w:rPr>
-        <w:t>smth</w:t>
-      </w:r>
-      <w:proofErr w:type="spellEnd"/>
-      <w:r>
-        <w:rPr>
-          <w:lang w:val="fr-FR"/>
-        </w:rPr>
-        <w:t xml:space="preserve"> like :</w:t>
-      </w:r>
+      <w:proofErr w:type="gramStart"/>
+      <w:r>
+        <w:rPr>
+          <w:lang w:val="en-US"/>
+        </w:rPr>
+        <w:t>like :</w:t>
+      </w:r>
+      <w:proofErr w:type="gramEnd"/>
     </w:p>
     <w:p>
       <w:pPr>
@@ -2724,21 +2704,13 @@
       </w:pPr>
       <w:r>
         <w:rPr>
-          <w:lang w:val="fr-FR"/>
-        </w:rPr>
-        <w:t xml:space="preserve">For </w:t>
-      </w:r>
-      <w:proofErr w:type="gramStart"/>
-      <w:r>
-        <w:rPr>
-          <w:lang w:val="fr-FR"/>
-        </w:rPr>
-        <w:t>e</w:t>
+          <w:lang w:val="en-US"/>
+        </w:rPr>
+        <w:t>For e</w:t>
       </w:r>
       <w:r>
         <w:t>xample:</w:t>
       </w:r>
-      <w:proofErr w:type="gramEnd"/>
     </w:p>
     <w:p>
       <w:pPr>
@@ -2981,7 +2953,7 @@
           <w:kern w:val="36"/>
           <w:sz w:val="48"/>
           <w:szCs w:val="48"/>
-          <w:lang w:val="fr-FR"/>
+          <w:lang w:val="en-US"/>
         </w:rPr>
       </w:pPr>
       <w:r>
@@ -3007,7 +2979,7 @@
           <w:b/>
           <w:bCs/>
           <w:kern w:val="36"/>
-          <w:lang w:val="fr-FR"/>
+          <w:lang w:val="en-US"/>
         </w:rPr>
         <w:t>:</w:t>
       </w:r>
@@ -5071,7 +5043,7 @@
     <w:p>
       <w:r>
         <w:rPr>
-          <w:lang w:val="fr-FR"/>
+          <w:lang w:val="en-US"/>
         </w:rPr>
         <w:t xml:space="preserve">      </w:t>
       </w:r>
@@ -5176,14 +5148,7 @@
           <w:rFonts w:ascii="Courier New" w:hAnsi="Courier New" w:cs="Courier New"/>
           <w:lang w:val="en-US"/>
         </w:rPr>
-        <w:t>ZAKATI</w:t>
-      </w:r>
-      <w:r>
-        <w:rPr>
-          <w:rFonts w:ascii="Courier New" w:hAnsi="Courier New" w:cs="Courier New"/>
-          <w:lang w:val="en-US"/>
-        </w:rPr>
-        <w:t xml:space="preserve"> DASHBOARD</w:t>
+        <w:t>ZAKATI DASHBOARD</w:t>
       </w:r>
     </w:p>
     <w:p>
@@ -5325,6 +5290,15 @@
         </w:rPr>
         <w:t xml:space="preserve"> Wealth</w:t>
       </w:r>
+      <w:r>
+        <w:rPr>
+          <w:rFonts w:ascii="Courier New" w:hAnsi="Courier New" w:cs="Courier New"/>
+          <w:b/>
+          <w:bCs/>
+          <w:lang w:val="en-US"/>
+        </w:rPr>
+        <w:t xml:space="preserve"> (all cash and bank balances….</w:t>
+      </w:r>
     </w:p>
     <w:p>
       <w:pPr>
@@ -5367,18 +5341,47 @@
         </w:rPr>
         <w:t>Eligible Deductions</w:t>
       </w:r>
-    </w:p>
-    <w:p>
-      <w:pPr>
-        <w:rPr>
-          <w:rFonts w:ascii="Courier New" w:hAnsi="Courier New" w:cs="Courier New"/>
-          <w:lang w:val="en-US"/>
-        </w:rPr>
-      </w:pPr>
-      <w:r>
-        <w:rPr>
-          <w:rFonts w:ascii="Courier New" w:hAnsi="Courier New" w:cs="Courier New"/>
-          <w:lang w:val="en-US"/>
+      <w:r>
+        <w:rPr>
+          <w:rFonts w:ascii="Courier New" w:hAnsi="Courier New" w:cs="Courier New"/>
+          <w:b/>
+          <w:bCs/>
+          <w:lang w:val="en-US"/>
+        </w:rPr>
+        <w:t xml:space="preserve"> (Nette </w:t>
+      </w:r>
+      <w:proofErr w:type="spellStart"/>
+      <w:r>
+        <w:rPr>
+          <w:rFonts w:ascii="Courier New" w:hAnsi="Courier New" w:cs="Courier New"/>
+          <w:b/>
+          <w:bCs/>
+          <w:lang w:val="en-US"/>
+        </w:rPr>
+        <w:t>fournisseur</w:t>
+      </w:r>
+      <w:proofErr w:type="spellEnd"/>
+      <w:r>
+        <w:rPr>
+          <w:rFonts w:ascii="Courier New" w:hAnsi="Courier New" w:cs="Courier New"/>
+          <w:b/>
+          <w:bCs/>
+          <w:lang w:val="en-US"/>
+        </w:rPr>
+        <w:t>)</w:t>
+      </w:r>
+    </w:p>
+    <w:p>
+      <w:pPr>
+        <w:rPr>
+          <w:rFonts w:ascii="Courier New" w:hAnsi="Courier New" w:cs="Courier New"/>
+          <w:lang w:val="fr-FR"/>
+        </w:rPr>
+      </w:pPr>
+      <w:r>
+        <w:rPr>
+          <w:rFonts w:ascii="Courier New" w:hAnsi="Courier New" w:cs="Courier New"/>
+          <w:lang w:val="fr-FR"/>
         </w:rPr>
         <w:t>1,200,000 DZD</w:t>
       </w:r>
@@ -5387,7 +5390,7 @@
       <w:pPr>
         <w:rPr>
           <w:rFonts w:ascii="Courier New" w:hAnsi="Courier New" w:cs="Courier New"/>
-          <w:lang w:val="en-US"/>
+          <w:lang w:val="fr-FR"/>
         </w:rPr>
       </w:pPr>
     </w:p>
@@ -5409,6 +5412,26 @@
         </w:rPr>
         <w:t>Net Zakat Base</w:t>
       </w:r>
+      <w:r>
+        <w:rPr>
+          <w:rFonts w:ascii="Courier New" w:hAnsi="Courier New" w:cs="Courier New"/>
+          <w:b/>
+          <w:bCs/>
+          <w:lang w:val="en-US"/>
+        </w:rPr>
+        <w:t xml:space="preserve"> to compare with </w:t>
+      </w:r>
+      <w:proofErr w:type="spellStart"/>
+      <w:r>
+        <w:rPr>
+          <w:rFonts w:ascii="Courier New" w:hAnsi="Courier New" w:cs="Courier New"/>
+          <w:b/>
+          <w:bCs/>
+          <w:lang w:val="en-US"/>
+        </w:rPr>
+        <w:t>nisab</w:t>
+      </w:r>
+      <w:proofErr w:type="spellEnd"/>
     </w:p>
     <w:p>
       <w:pPr>
@@ -5777,27 +5800,14 @@
         <w:rPr>
           <w:highlight w:val="green"/>
         </w:rPr>
-        <w:t>Zakat date</w:t>
+        <w:t>Zakat date </w:t>
       </w:r>
       <w:r>
         <w:rPr>
           <w:highlight w:val="green"/>
-        </w:rPr>
-        <w:t> </w:t>
-      </w:r>
-      <w:r>
-        <w:rPr>
-          <w:highlight w:val="green"/>
-          <w:lang w:val="en-US"/>
-        </w:rPr>
-        <w:t xml:space="preserve">: </w:t>
-      </w:r>
-      <w:r>
-        <w:rPr>
-          <w:highlight w:val="green"/>
-          <w:lang w:val="en-US"/>
-        </w:rPr>
-        <w:t>Zakat Due Date</w:t>
+          <w:lang w:val="en-US"/>
+        </w:rPr>
+        <w:t>: Zakat Due Date</w:t>
       </w:r>
       <w:r>
         <w:rPr>
@@ -5917,7 +5927,21 @@
         <w:rPr>
           <w:lang w:val="en-US"/>
         </w:rPr>
-        <w:t xml:space="preserve"> added ): compared to </w:t>
+        <w:t xml:space="preserve"> </w:t>
+      </w:r>
+      <w:proofErr w:type="gramStart"/>
+      <w:r>
+        <w:rPr>
+          <w:lang w:val="en-US"/>
+        </w:rPr>
+        <w:t>added )</w:t>
+      </w:r>
+      <w:proofErr w:type="gramEnd"/>
+      <w:r>
+        <w:rPr>
+          <w:lang w:val="en-US"/>
+        </w:rPr>
+        <w:t xml:space="preserve">: compared to </w:t>
       </w:r>
       <w:r>
         <w:rPr>
@@ -6500,19 +6524,8 @@
           <w:highlight w:val="magenta"/>
           <w:lang w:val="fr-FR"/>
         </w:rPr>
-        <w:t xml:space="preserve">Zakat </w:t>
-      </w:r>
-      <w:proofErr w:type="spellStart"/>
-      <w:r>
-        <w:rPr>
-          <w:i/>
-          <w:iCs/>
-          <w:highlight w:val="magenta"/>
-          <w:lang w:val="fr-FR"/>
-        </w:rPr>
-        <w:t>History</w:t>
-      </w:r>
-      <w:proofErr w:type="spellEnd"/>
+        <w:t>Zakat History</w:t>
+      </w:r>
       <w:r>
         <w:rPr>
           <w:i/>
@@ -7088,7 +7101,7 @@
 </file>
 
 <file path=word/numbering.xml><?xml version="1.0" encoding="utf-8"?>
-<w:numbering xmlns:wpc="http://schemas.microsoft.com/office/word/2010/wordprocessingCanvas" xmlns:cx="http://schemas.microsoft.com/office/drawing/2014/chartex" xmlns:cx1="http://schemas.microsoft.com/office/drawing/2015/9/8/chartex" xmlns:cx2="http://schemas.microsoft.com/office/drawing/2015/10/21/chartex" xmlns:cx3="http://schemas.microsoft.com/office/drawing/2016/5/9/chartex" xmlns:cx4="http://schemas.microsoft.com/office/drawing/2016/5/10/chartex" xmlns:cx5="http://schemas.microsoft.com/office/drawing/2016/5/11/chartex" xmlns:cx6="http://schemas.microsoft.com/office/drawing/2016/5/12/chartex" xmlns:cx7="http://schemas.microsoft.com/office/drawing/2016/5/13/chartex" xmlns:cx8="http://schemas.microsoft.com/office/drawing/2016/5/14/chartex" xmlns:mc="http://schemas.openxmlformats.org/markup-compatibility/2006" xmlns:aink="http://schemas.microsoft.com/office/drawing/2016/ink" xmlns:am3d="http://schemas.microsoft.com/office/drawing/2017/model3d" xmlns:o="urn:schemas-microsoft-com:office:office" xmlns:oel="http://schemas.microsoft.com/office/2019/extlst" xmlns:r="http://schemas.openxmlformats.org/officeDocument/2006/relationships" xmlns:m="http://schemas.openxmlformats.org/officeDocument/2006/math" xmlns:v="urn:schemas-microsoft-com:vml" xmlns:wp14="http://schemas.microsoft.com/office/word/2010/wordprocessingDrawing" xmlns:wp="http://schemas.openxmlformats.org/drawingml/2006/wordprocessingDrawing" xmlns:w10="urn:schemas-microsoft-com:office:word" xmlns:w="http://schemas.openxmlformats.org/wordprocessingml/2006/main" xmlns:w14="http://schemas.microsoft.com/office/word/2010/wordml" xmlns:w15="http://schemas.microsoft.com/office/word/2012/wordml" xmlns:w16cex="http://schemas.microsoft.com/office/word/2018/wordml/cex" xmlns:w16cid="http://schemas.microsoft.com/office/word/2016/wordml/cid" xmlns:w16="http://schemas.microsoft.com/office/word/2018/wordml" xmlns:w16sdtdh="http://schemas.microsoft.com/office/word/2020/wordml/sdtdatahash" xmlns:w16se="http://schemas.microsoft.com/office/word/2015/wordml/symex" xmlns:wpg="http://schemas.microsoft.com/office/word/2010/wordprocessingGroup" xmlns:wpi="http://schemas.microsoft.com/office/word/2010/wordprocessingInk" xmlns:wne="http://schemas.microsoft.com/office/word/2006/wordml" xmlns:wps="http://schemas.microsoft.com/office/word/2010/wordprocessingShape" mc:Ignorable="w14 w15 w16se w16cid w16 w16cex w16sdtdh wp14">
+<w:numbering xmlns:wpc="http://schemas.microsoft.com/office/word/2010/wordprocessingCanvas" xmlns:cx="http://schemas.microsoft.com/office/drawing/2014/chartex" xmlns:cx1="http://schemas.microsoft.com/office/drawing/2015/9/8/chartex" xmlns:cx2="http://schemas.microsoft.com/office/drawing/2015/10/21/chartex" xmlns:cx3="http://schemas.microsoft.com/office/drawing/2016/5/9/chartex" xmlns:cx4="http://schemas.microsoft.com/office/drawing/2016/5/10/chartex" xmlns:cx5="http://schemas.microsoft.com/office/drawing/2016/5/11/chartex" xmlns:cx6="http://schemas.microsoft.com/office/drawing/2016/5/12/chartex" xmlns:cx7="http://schemas.microsoft.com/office/drawing/2016/5/13/chartex" xmlns:cx8="http://schemas.microsoft.com/office/drawing/2016/5/14/chartex" xmlns:mc="http://schemas.openxmlformats.org/markup-compatibility/2006" xmlns:aink="http://schemas.microsoft.com/office/drawing/2016/ink" xmlns:am3d="http://schemas.microsoft.com/office/drawing/2017/model3d" xmlns:o="urn:schemas-microsoft-com:office:office" xmlns:oel="http://schemas.microsoft.com/office/2019/extlst" xmlns:r="http://schemas.openxmlformats.org/officeDocument/2006/relationships" xmlns:m="http://schemas.openxmlformats.org/officeDocument/2006/math" xmlns:v="urn:schemas-microsoft-com:vml" xmlns:wp14="http://schemas.microsoft.com/office/word/2010/wordprocessingDrawing" xmlns:wp="http://schemas.openxmlformats.org/drawingml/2006/wordprocessingDrawing" xmlns:w10="urn:schemas-microsoft-com:office:word" xmlns:w="http://schemas.openxmlformats.org/wordprocessingml/2006/main" xmlns:w14="http://schemas.microsoft.com/office/word/2010/wordml" xmlns:w15="http://schemas.microsoft.com/office/word/2012/wordml" xmlns:w16cex="http://schemas.microsoft.com/office/word/2018/wordml/cex" xmlns:w16cid="http://schemas.microsoft.com/office/word/2016/wordml/cid" xmlns:w16="http://schemas.microsoft.com/office/word/2018/wordml" xmlns:w16du="http://schemas.microsoft.com/office/word/2023/wordml/word16du" xmlns:w16sdtdh="http://schemas.microsoft.com/office/word/2020/wordml/sdtdatahash" xmlns:w16sdtfl="http://schemas.microsoft.com/office/word/2024/wordml/sdtformatlock" xmlns:w16se="http://schemas.microsoft.com/office/word/2015/wordml/symex" xmlns:wpg="http://schemas.microsoft.com/office/word/2010/wordprocessingGroup" xmlns:wpi="http://schemas.microsoft.com/office/word/2010/wordprocessingInk" xmlns:wne="http://schemas.microsoft.com/office/word/2006/wordml" xmlns:wps="http://schemas.microsoft.com/office/word/2010/wordprocessingShape" mc:Ignorable="w14 w15 w16se w16cid w16 w16cex w16sdtdh w16sdtfl w16du wp14">
   <w:abstractNum w:abstractNumId="0" w15:restartNumberingAfterBreak="0">
     <w:nsid w:val="1FFB1521"/>
     <w:multiLevelType w:val="multilevel"/>
@@ -8120,7 +8133,7 @@
 </file>
 
 <file path=word/styles.xml><?xml version="1.0" encoding="utf-8"?>
-<w:styles xmlns:mc="http://schemas.openxmlformats.org/markup-compatibility/2006" xmlns:r="http://schemas.openxmlformats.org/officeDocument/2006/relationships" xmlns:w="http://schemas.openxmlformats.org/wordprocessingml/2006/main" xmlns:w14="http://schemas.microsoft.com/office/word/2010/wordml" xmlns:w15="http://schemas.microsoft.com/office/word/2012/wordml" xmlns:w16cex="http://schemas.microsoft.com/office/word/2018/wordml/cex" xmlns:w16cid="http://schemas.microsoft.com/office/word/2016/wordml/cid" xmlns:w16="http://schemas.microsoft.com/office/word/2018/wordml" xmlns:w16sdtdh="http://schemas.microsoft.com/office/word/2020/wordml/sdtdatahash" xmlns:w16se="http://schemas.microsoft.com/office/word/2015/wordml/symex" mc:Ignorable="w14 w15 w16se w16cid w16 w16cex w16sdtdh">
+<w:styles xmlns:mc="http://schemas.openxmlformats.org/markup-compatibility/2006" xmlns:r="http://schemas.openxmlformats.org/officeDocument/2006/relationships" xmlns:w="http://schemas.openxmlformats.org/wordprocessingml/2006/main" xmlns:w14="http://schemas.microsoft.com/office/word/2010/wordml" xmlns:w15="http://schemas.microsoft.com/office/word/2012/wordml" xmlns:w16cex="http://schemas.microsoft.com/office/word/2018/wordml/cex" xmlns:w16cid="http://schemas.microsoft.com/office/word/2016/wordml/cid" xmlns:w16="http://schemas.microsoft.com/office/word/2018/wordml" xmlns:w16du="http://schemas.microsoft.com/office/word/2023/wordml/word16du" xmlns:w16sdtdh="http://schemas.microsoft.com/office/word/2020/wordml/sdtdatahash" xmlns:w16sdtfl="http://schemas.microsoft.com/office/word/2024/wordml/sdtformatlock" xmlns:w16se="http://schemas.microsoft.com/office/word/2015/wordml/symex" mc:Ignorable="w14 w15 w16se w16cid w16 w16cex w16sdtdh w16sdtfl w16du">
   <w:docDefaults>
     <w:rPrDefault>
       <w:rPr>
@@ -8128,7 +8141,7 @@
         <w:kern w:val="2"/>
         <w:sz w:val="24"/>
         <w:szCs w:val="24"/>
-        <w:lang w:val="fr-DZ" w:eastAsia="en-US" w:bidi="ar-SA"/>
+        <w:lang w:eastAsia="en-US" w:bidi="ar-SA"/>
         <w14:ligatures w14:val="standardContextual"/>
       </w:rPr>
     </w:rPrDefault>
@@ -8565,6 +8578,7 @@
   <w:style w:type="character" w:default="1" w:styleId="Policepardfaut">
     <w:name w:val="Default Paragraph Font"/>
     <w:uiPriority w:val="1"/>
+    <w:semiHidden/>
     <w:unhideWhenUsed/>
   </w:style>
   <w:style w:type="table" w:default="1" w:styleId="TableauNormal">

</xml_diff>